<commit_message>
Remove US overlap line from Turing resume header
Keep contact details only under the name for a cleaner header.

Co-authored-by: Anannya Rai Paul <anannyarp12@users.noreply.github.com>
</commit_message>
<xml_diff>
--- a/resume/Ananya_Rai_Paul_Resume_Turing.docx
+++ b/resume/Ananya_Rai_Paul_Resume_Turing.docx
@@ -18,7 +18,7 @@
     </w:p>
     <w:p>
       <w:pPr>
-        <w:spacing w:after="20" w:before="0"/>
+        <w:spacing w:after="120" w:before="0"/>
         <w:jc w:val="center"/>
       </w:pPr>
       <w:r>
@@ -28,20 +28,6 @@
           <w:sz w:val="18"/>
         </w:rPr>
         <w:t>anannyaraipaul@gmail.com | linkedin.com/in/annyarp | github.com/anannyarp12 | +91 9933491546</w:t>
-      </w:r>
-    </w:p>
-    <w:p>
-      <w:pPr>
-        <w:spacing w:after="120" w:before="0"/>
-        <w:jc w:val="center"/>
-      </w:pPr>
-      <w:r>
-        <w:rPr>
-          <w:rFonts w:ascii="Calibri" w:hAnsi="Calibri"/>
-          <w:b w:val="0"/>
-          <w:sz w:val="18"/>
-        </w:rPr>
-        <w:t>Remote-ready | Available for 4-hour overlap with US time zones | Full-time</w:t>
       </w:r>
     </w:p>
     <w:p>

</xml_diff>